<commit_message>
Update CV and tidy beta review output
</commit_message>
<xml_diff>
--- a/public/cv/CV_Charles_Joshua_Uy.docx
+++ b/public/cv/CV_Charles_Joshua_Uy.docx
@@ -408,6 +408,180 @@
                 <w:sz w:val="20"/>
                 <w:szCs w:val="20"/>
               </w:rPr>
+              <w:t>The Hong Kong University of Science and Technology (HKUST)</w:t>
+            </w:r>
+          </w:p>
+        </w:tc>
+        <w:tc>
+          <w:tcPr>
+            <w:tcW w:type="dxa" w:w="2800"/>
+            <w:tcBorders>
+              <w:top w:val="none" w:color="FFFFFF" w:sz="0"/>
+              <w:left w:val="none" w:color="FFFFFF" w:sz="0"/>
+              <w:bottom w:val="none" w:color="FFFFFF" w:sz="0"/>
+              <w:right w:val="none" w:color="FFFFFF" w:sz="0"/>
+            </w:tcBorders>
+            <w:tcMar>
+              <w:top w:type="dxa" w:w="0"/>
+              <w:left w:type="dxa" w:w="0"/>
+              <w:bottom w:type="dxa" w:w="0"/>
+              <w:right w:type="dxa" w:w="0"/>
+            </w:tcMar>
+            <w:vAlign w:val="top"/>
+          </w:tcPr>
+          <w:p>
+            <w:pPr>
+              <w:keepNext/>
+              <w:spacing w:after="0" w:before="160"/>
+              <w:jc w:val="right"/>
+            </w:pPr>
+            <w:r>
+              <w:rPr>
+                <w:rFonts w:ascii="Times New Roman" w:cs="Times New Roman" w:eastAsia="Times New Roman" w:hAnsi="Times New Roman"/>
+                <w:sz w:val="20"/>
+                <w:szCs w:val="20"/>
+              </w:rPr>
+              <w:t>Hong Kong</w:t>
+            </w:r>
+          </w:p>
+        </w:tc>
+      </w:tr>
+    </w:tbl>
+    <w:tbl>
+      <w:tblPr>
+        <w:tblW w:type="dxa" w:w="9360"/>
+        <w:tblBorders>
+          <w:top w:val="single" w:color="auto" w:sz="4"/>
+          <w:left w:val="single" w:color="auto" w:sz="4"/>
+          <w:bottom w:val="single" w:color="auto" w:sz="4"/>
+          <w:right w:val="single" w:color="auto" w:sz="4"/>
+          <w:insideH w:val="single" w:color="auto" w:sz="4"/>
+          <w:insideV w:val="single" w:color="auto" w:sz="4"/>
+        </w:tblBorders>
+      </w:tblPr>
+      <w:tblGrid>
+        <w:gridCol w:w="6560"/>
+        <w:gridCol w:w="2800"/>
+      </w:tblGrid>
+      <w:tr>
+        <w:tc>
+          <w:tcPr>
+            <w:tcW w:type="dxa" w:w="6560"/>
+            <w:tcBorders>
+              <w:top w:val="none" w:color="FFFFFF" w:sz="0"/>
+              <w:left w:val="none" w:color="FFFFFF" w:sz="0"/>
+              <w:bottom w:val="none" w:color="FFFFFF" w:sz="0"/>
+              <w:right w:val="none" w:color="FFFFFF" w:sz="0"/>
+            </w:tcBorders>
+            <w:tcMar>
+              <w:top w:type="dxa" w:w="0"/>
+              <w:left w:type="dxa" w:w="0"/>
+              <w:bottom w:type="dxa" w:w="0"/>
+              <w:right w:type="dxa" w:w="0"/>
+            </w:tcMar>
+            <w:vAlign w:val="top"/>
+          </w:tcPr>
+          <w:p>
+            <w:pPr>
+              <w:keepNext/>
+              <w:spacing w:after="0"/>
+            </w:pPr>
+            <w:r>
+              <w:rPr>
+                <w:rFonts w:ascii="Times New Roman" w:cs="Times New Roman" w:eastAsia="Times New Roman" w:hAnsi="Times New Roman"/>
+                <w:i/>
+                <w:iCs/>
+                <w:sz w:val="20"/>
+                <w:szCs w:val="20"/>
+              </w:rPr>
+              <w:t>Exchange Student (one semester)</w:t>
+            </w:r>
+          </w:p>
+        </w:tc>
+        <w:tc>
+          <w:tcPr>
+            <w:tcW w:type="dxa" w:w="2800"/>
+            <w:tcBorders>
+              <w:top w:val="none" w:color="FFFFFF" w:sz="0"/>
+              <w:left w:val="none" w:color="FFFFFF" w:sz="0"/>
+              <w:bottom w:val="none" w:color="FFFFFF" w:sz="0"/>
+              <w:right w:val="none" w:color="FFFFFF" w:sz="0"/>
+            </w:tcBorders>
+            <w:tcMar>
+              <w:top w:type="dxa" w:w="0"/>
+              <w:left w:type="dxa" w:w="0"/>
+              <w:bottom w:type="dxa" w:w="0"/>
+              <w:right w:type="dxa" w:w="0"/>
+            </w:tcMar>
+            <w:vAlign w:val="top"/>
+          </w:tcPr>
+          <w:p>
+            <w:pPr>
+              <w:keepNext/>
+              <w:spacing w:after="0"/>
+              <w:jc w:val="right"/>
+            </w:pPr>
+            <w:r>
+              <w:rPr>
+                <w:rFonts w:ascii="Times New Roman" w:cs="Times New Roman" w:eastAsia="Times New Roman" w:hAnsi="Times New Roman"/>
+                <w:i/>
+                <w:iCs/>
+                <w:sz w:val="20"/>
+                <w:szCs w:val="20"/>
+              </w:rPr>
+              <w:t>2026 - Present</w:t>
+            </w:r>
+          </w:p>
+        </w:tc>
+      </w:tr>
+    </w:tbl>
+    <w:tbl>
+      <w:tblPr>
+        <w:tblW w:type="dxa" w:w="9360"/>
+        <w:tblBorders>
+          <w:top w:val="single" w:color="auto" w:sz="4"/>
+          <w:left w:val="single" w:color="auto" w:sz="4"/>
+          <w:bottom w:val="single" w:color="auto" w:sz="4"/>
+          <w:right w:val="single" w:color="auto" w:sz="4"/>
+          <w:insideH w:val="single" w:color="auto" w:sz="4"/>
+          <w:insideV w:val="single" w:color="auto" w:sz="4"/>
+        </w:tblBorders>
+      </w:tblPr>
+      <w:tblGrid>
+        <w:gridCol w:w="6560"/>
+        <w:gridCol w:w="2800"/>
+      </w:tblGrid>
+      <w:tr>
+        <w:tc>
+          <w:tcPr>
+            <w:tcW w:type="dxa" w:w="6560"/>
+            <w:tcBorders>
+              <w:top w:val="none" w:color="FFFFFF" w:sz="0"/>
+              <w:left w:val="none" w:color="FFFFFF" w:sz="0"/>
+              <w:bottom w:val="none" w:color="FFFFFF" w:sz="0"/>
+              <w:right w:val="none" w:color="FFFFFF" w:sz="0"/>
+            </w:tcBorders>
+            <w:tcMar>
+              <w:top w:type="dxa" w:w="0"/>
+              <w:left w:type="dxa" w:w="0"/>
+              <w:bottom w:type="dxa" w:w="0"/>
+              <w:right w:type="dxa" w:w="0"/>
+            </w:tcMar>
+            <w:vAlign w:val="top"/>
+          </w:tcPr>
+          <w:p>
+            <w:pPr>
+              <w:keepNext/>
+              <w:spacing w:after="0" w:before="160"/>
+            </w:pPr>
+            <w:r>
+              <w:rPr>
+                <w:rFonts w:ascii="Times New Roman" w:cs="Times New Roman" w:eastAsia="Times New Roman" w:hAnsi="Times New Roman"/>
+                <w:b/>
+                <w:bCs/>
+                <w:sz w:val="20"/>
+                <w:szCs w:val="20"/>
+              </w:rPr>
               <w:t xml:space="preserve">Philippine Science High School — Eastern Visayas Campus</w:t>
             </w:r>
           </w:p>
@@ -4156,7 +4330,7 @@
                 <w:sz w:val="20"/>
                 <w:szCs w:val="20"/>
               </w:rPr>
-              <w:t xml:space="preserve">2026 – Present</w:t>
+              <w:t>June - August 2026</w:t>
             </w:r>
           </w:p>
         </w:tc>
@@ -4209,7 +4383,7 @@
                 <w:sz w:val="20"/>
                 <w:szCs w:val="20"/>
               </w:rPr>
-              <w:t xml:space="preserve">Operations Analyst — QA &amp; Automation</w:t>
+              <w:t>QA Automation Developer</w:t>
             </w:r>
           </w:p>
         </w:tc>
@@ -4265,7 +4439,25 @@
           <w:sz w:val="20"/>
           <w:szCs w:val="20"/>
         </w:rPr>
-        <w:t xml:space="preserve">Support QA operations for a Singapore-based startup, building automated QA tooling to streamline testing and release workflows</w:t>
+        <w:t>Built an automated end-to-end UI testing framework using Playwright and Python for a Singapore-based company</w:t>
+      </w:r>
+    </w:p>
+    <w:p>
+      <w:pPr>
+        <w:pStyle w:val="ListParagraph"/>
+        <w:numPr>
+          <w:ilvl w:val="0"/>
+          <w:numId w:val="2"/>
+        </w:numPr>
+        <w:spacing w:after="20" w:before="0"/>
+      </w:pPr>
+      <w:r>
+        <w:rPr>
+          <w:rFonts w:ascii="Times New Roman" w:cs="Times New Roman" w:eastAsia="Times New Roman" w:hAnsi="Times New Roman"/>
+          <w:sz w:val="20"/>
+          <w:szCs w:val="20"/>
+        </w:rPr>
+        <w:t>Automated user workflows, including account creation, to catch UI issues beyond unit-test coverage</w:t>
       </w:r>
     </w:p>
     <w:tbl>
@@ -4611,7 +4803,7 @@
                 <w:sz w:val="20"/>
                 <w:szCs w:val="20"/>
               </w:rPr>
-              <w:t xml:space="preserve">Deputy for Administration &amp; Lead Developer</w:t>
+              <w:t>Deputy for Web Development</w:t>
             </w:r>
           </w:p>
         </w:tc>
@@ -4646,7 +4838,7 @@
                 <w:sz w:val="20"/>
                 <w:szCs w:val="20"/>
               </w:rPr>
-              <w:t xml:space="preserve">Ateneo de Manila University</w:t>
+              <w:t>2026 - Present</w:t>
             </w:r>
           </w:p>
         </w:tc>
@@ -4667,7 +4859,113 @@
           <w:sz w:val="20"/>
           <w:szCs w:val="20"/>
         </w:rPr>
-        <w:t xml:space="preserve">Lead the ARSA Digital Ecosystem: a self-hosted hub with a custom URL shortener, event ticketing, admin panels, and an e-commerce shop</w:t>
+        <w:t>Head ARSA Portal, a new branch under the Department of Administration, with a dedicated focus on developing the association's website</w:t>
+      </w:r>
+    </w:p>
+    <w:tbl>
+      <w:tblPr>
+        <w:tblW w:type="dxa" w:w="9360"/>
+        <w:tblBorders>
+          <w:top w:val="single" w:color="auto" w:sz="4"/>
+          <w:left w:val="single" w:color="auto" w:sz="4"/>
+          <w:bottom w:val="single" w:color="auto" w:sz="4"/>
+          <w:right w:val="single" w:color="auto" w:sz="4"/>
+          <w:insideH w:val="single" w:color="auto" w:sz="4"/>
+          <w:insideV w:val="single" w:color="auto" w:sz="4"/>
+        </w:tblBorders>
+      </w:tblPr>
+      <w:tblGrid>
+        <w:gridCol w:w="6560"/>
+        <w:gridCol w:w="2800"/>
+      </w:tblGrid>
+      <w:tr>
+        <w:tc>
+          <w:tcPr>
+            <w:tcW w:type="dxa" w:w="6560"/>
+            <w:tcBorders>
+              <w:top w:val="none" w:color="FFFFFF" w:sz="0"/>
+              <w:left w:val="none" w:color="FFFFFF" w:sz="0"/>
+              <w:bottom w:val="none" w:color="FFFFFF" w:sz="0"/>
+              <w:right w:val="none" w:color="FFFFFF" w:sz="0"/>
+            </w:tcBorders>
+            <w:tcMar>
+              <w:top w:type="dxa" w:w="0"/>
+              <w:left w:type="dxa" w:w="0"/>
+              <w:bottom w:type="dxa" w:w="0"/>
+              <w:right w:type="dxa" w:w="0"/>
+            </w:tcMar>
+            <w:vAlign w:val="top"/>
+          </w:tcPr>
+          <w:p>
+            <w:pPr>
+              <w:keepNext/>
+              <w:spacing w:after="0"/>
+            </w:pPr>
+            <w:r>
+              <w:rPr>
+                <w:rFonts w:ascii="Times New Roman" w:cs="Times New Roman" w:eastAsia="Times New Roman" w:hAnsi="Times New Roman"/>
+                <w:i/>
+                <w:iCs/>
+                <w:sz w:val="20"/>
+                <w:szCs w:val="20"/>
+              </w:rPr>
+              <w:t>Deputy for Administration &amp; Lead Developer</w:t>
+            </w:r>
+          </w:p>
+        </w:tc>
+        <w:tc>
+          <w:tcPr>
+            <w:tcW w:type="dxa" w:w="2800"/>
+            <w:tcBorders>
+              <w:top w:val="none" w:color="FFFFFF" w:sz="0"/>
+              <w:left w:val="none" w:color="FFFFFF" w:sz="0"/>
+              <w:bottom w:val="none" w:color="FFFFFF" w:sz="0"/>
+              <w:right w:val="none" w:color="FFFFFF" w:sz="0"/>
+            </w:tcBorders>
+            <w:tcMar>
+              <w:top w:type="dxa" w:w="0"/>
+              <w:left w:type="dxa" w:w="0"/>
+              <w:bottom w:type="dxa" w:w="0"/>
+              <w:right w:type="dxa" w:w="0"/>
+            </w:tcMar>
+            <w:vAlign w:val="top"/>
+          </w:tcPr>
+          <w:p>
+            <w:pPr>
+              <w:keepNext/>
+              <w:spacing w:after="0"/>
+              <w:jc w:val="right"/>
+            </w:pPr>
+            <w:r>
+              <w:rPr>
+                <w:rFonts w:ascii="Times New Roman" w:cs="Times New Roman" w:eastAsia="Times New Roman" w:hAnsi="Times New Roman"/>
+                <w:i/>
+                <w:iCs/>
+                <w:sz w:val="20"/>
+                <w:szCs w:val="20"/>
+              </w:rPr>
+              <w:t>2025 - 2026</w:t>
+            </w:r>
+          </w:p>
+        </w:tc>
+      </w:tr>
+    </w:tbl>
+    <w:p>
+      <w:pPr>
+        <w:pStyle w:val="ListParagraph"/>
+        <w:numPr>
+          <w:ilvl w:val="0"/>
+          <w:numId w:val="2"/>
+        </w:numPr>
+        <w:spacing w:after="20" w:before="0"/>
+      </w:pPr>
+      <w:r>
+        <w:rPr>
+          <w:rFonts w:ascii="Times New Roman" w:cs="Times New Roman" w:eastAsia="Times New Roman" w:hAnsi="Times New Roman"/>
+          <w:sz w:val="20"/>
+          <w:szCs w:val="20"/>
+        </w:rPr>
+        <w:t>Led website development for the ARSA Digital Ecosystem: a self-hosted hub with a custom URL shortener, event ticketing, admin panels, and an e-commerce shop</w:t>
       </w:r>
     </w:p>
     <w:p>
@@ -4703,7 +5001,7 @@
           <w:sz w:val="20"/>
           <w:szCs w:val="20"/>
         </w:rPr>
-        <w:t xml:space="preserve">Create masterfiles and cross-departmental systems for community events and projects</w:t>
+        <w:t>Handled administrative work, including masterfiles and cross-departmental systems, and served as Secretariat Head for ARSA Seniors' Send-Off 2026</w:t>
       </w:r>
     </w:p>
     <w:tbl>
@@ -5333,7 +5631,7 @@
           <w:sz w:val="20"/>
           <w:szCs w:val="20"/>
         </w:rPr>
-        <w:t xml:space="preserve">Building CODE Nest, the org’s internal digital infrastructure platform</w:t>
+        <w:t>Building CODE Portal, the org’s internal digital infrastructure platform</w:t>
       </w:r>
     </w:p>
     <w:tbl>
@@ -7278,7 +7576,7 @@
                 <w:sz w:val="20"/>
                 <w:szCs w:val="20"/>
               </w:rPr>
-              <w:t xml:space="preserve">CODE Nest</w:t>
+              <w:t>CODE Portal</w:t>
             </w:r>
           </w:p>
         </w:tc>

</xml_diff>